<commit_message>
feat: make student corner activities and clubs dynamic and editable by admins
</commit_message>
<xml_diff>
--- a/Super Admini.docx
+++ b/Super Admini.docx
@@ -512,8 +512,8 @@
           <w:noProof/>
         </w:rPr>
         <w:drawing>
-          <wp:inline distT="0" distB="0" distL="0" distR="0" wp14:anchorId="4FB27EAC" wp14:editId="47957E8E">
-            <wp:extent cx="4762500" cy="4762500"/>
+          <wp:inline distT="0" distB="0" distL="0" distR="0" wp14:anchorId="4FB27EAC" wp14:editId="382CB3A4">
+            <wp:extent cx="1815152" cy="1815152"/>
             <wp:effectExtent l="0" t="0" r="0" b="0"/>
             <wp:docPr id="796142753" name="Picture 6" descr="Government Naveen College Logo">
               <a:hlinkClick xmlns:a="http://schemas.openxmlformats.org/drawingml/2006/main" r:id="rId4"/>
@@ -533,7 +533,7 @@
                     </pic:cNvPicPr>
                   </pic:nvPicPr>
                   <pic:blipFill>
-                    <a:blip r:embed="rId5">
+                    <a:blip r:embed="rId6" cstate="print">
                       <a:extLst>
                         <a:ext uri="{28A0092B-C50C-407E-A947-70E740481C1C}">
                           <a14:useLocalDpi xmlns:a14="http://schemas.microsoft.com/office/drawing/2010/main" val="0"/>
@@ -548,7 +548,7 @@
                   <pic:spPr bwMode="auto">
                     <a:xfrm>
                       <a:off x="0" y="0"/>
-                      <a:ext cx="4762500" cy="4762500"/>
+                      <a:ext cx="1820633" cy="1820633"/>
                     </a:xfrm>
                     <a:prstGeom prst="rect">
                       <a:avLst/>
@@ -798,6 +798,11 @@
     </w:p>
     <w:p/>
     <w:p>
+      <w:pPr>
+        <w:rPr>
+          <w:rFonts w:cs="Mangal"/>
+        </w:rPr>
+      </w:pPr>
       <w:proofErr w:type="spellStart"/>
       <w:r>
         <w:rPr>
@@ -934,11 +939,708 @@
           <w:rFonts w:cs="Mangal"/>
         </w:rPr>
         <w:t xml:space="preserve"> KARO</w:t>
+      </w:r>
+    </w:p>
+    <w:p>
+      <w:pPr>
+        <w:rPr>
+          <w:b/>
+          <w:bCs/>
+        </w:rPr>
+      </w:pPr>
+      <w:r>
+        <w:rPr>
+          <w:rFonts w:ascii="Mangal" w:hAnsi="Mangal" w:cs="Mangal"/>
+          <w:b/>
+          <w:bCs/>
+          <w:lang w:bidi="hi-IN"/>
+        </w:rPr>
+        <w:t>https://gncs.ink/departments</w:t>
+      </w:r>
+      <w:r>
+        <w:rPr>
+          <w:rFonts w:ascii="Mangal" w:hAnsi="Mangal" w:cs="Mangal"/>
+          <w:b/>
+          <w:bCs/>
+          <w:lang w:bidi="hi-IN"/>
+        </w:rPr>
+        <w:t xml:space="preserve"> me "</w:t>
+      </w:r>
+      <w:r>
+        <w:rPr>
+          <w:rFonts w:ascii="Mangal" w:hAnsi="Mangal" w:cs="Mangal" w:hint="cs"/>
+          <w:b/>
+          <w:bCs/>
+          <w:cs/>
+          <w:lang w:bidi="hi-IN"/>
+        </w:rPr>
+        <w:t>पाठ्यक्रम</w:t>
+      </w:r>
+      <w:r>
+        <w:rPr>
+          <w:b/>
+          <w:bCs/>
+        </w:rPr>
+        <w:t xml:space="preserve"> | </w:t>
+      </w:r>
+      <w:r>
+        <w:rPr>
+          <w:rFonts w:ascii="Mangal" w:hAnsi="Mangal" w:cs="Mangal" w:hint="cs"/>
+          <w:b/>
+          <w:bCs/>
+          <w:cs/>
+          <w:lang w:bidi="hi-IN"/>
+        </w:rPr>
+        <w:t>पाठ्यक्रम</w:t>
+      </w:r>
+      <w:r>
+        <w:rPr>
+          <w:b/>
+          <w:bCs/>
+          <w:cs/>
+          <w:lang w:bidi="hi-IN"/>
+        </w:rPr>
+        <w:t xml:space="preserve"> </w:t>
+      </w:r>
+      <w:r>
+        <w:rPr>
+          <w:rFonts w:ascii="Mangal" w:hAnsi="Mangal" w:cs="Mangal" w:hint="cs"/>
+          <w:b/>
+          <w:bCs/>
+          <w:cs/>
+          <w:lang w:bidi="hi-IN"/>
+        </w:rPr>
+        <w:t>डाउनलोड</w:t>
+      </w:r>
+      <w:r>
+        <w:rPr>
+          <w:rFonts w:ascii="Mangal" w:hAnsi="Mangal" w:cs="Mangal"/>
+          <w:b/>
+          <w:bCs/>
+          <w:lang w:bidi="hi-IN"/>
+        </w:rPr>
+        <w:t xml:space="preserve">" ko </w:t>
+      </w:r>
+      <w:proofErr w:type="spellStart"/>
+      <w:r>
+        <w:rPr>
+          <w:rFonts w:ascii="Mangal" w:hAnsi="Mangal" w:cs="Mangal"/>
+          <w:b/>
+          <w:bCs/>
+          <w:lang w:bidi="hi-IN"/>
+        </w:rPr>
+        <w:t>hatana</w:t>
+      </w:r>
+      <w:proofErr w:type="spellEnd"/>
+      <w:r>
+        <w:rPr>
+          <w:rFonts w:ascii="Mangal" w:hAnsi="Mangal" w:cs="Mangal"/>
+          <w:b/>
+          <w:bCs/>
+          <w:lang w:bidi="hi-IN"/>
+        </w:rPr>
+        <w:t xml:space="preserve"> </w:t>
+      </w:r>
+      <w:proofErr w:type="spellStart"/>
+      <w:r>
+        <w:rPr>
+          <w:rFonts w:ascii="Mangal" w:hAnsi="Mangal" w:cs="Mangal"/>
+          <w:b/>
+          <w:bCs/>
+          <w:lang w:bidi="hi-IN"/>
+        </w:rPr>
+        <w:t>hai</w:t>
+      </w:r>
+      <w:proofErr w:type="spellEnd"/>
+      <w:r>
+        <w:rPr>
+          <w:rFonts w:ascii="Mangal" w:hAnsi="Mangal" w:cs="Mangal"/>
+          <w:b/>
+          <w:bCs/>
+          <w:lang w:bidi="hi-IN"/>
+        </w:rPr>
+        <w:t xml:space="preserve">. </w:t>
+      </w:r>
+    </w:p>
+    <w:p>
+      <w:pPr>
+        <w:rPr>
+          <w:rFonts w:ascii="Mangal" w:hAnsi="Mangal" w:cs="Mangal"/>
+          <w:b/>
+          <w:bCs/>
+          <w:lang w:bidi="hi-IN"/>
+        </w:rPr>
+      </w:pPr>
+    </w:p>
+    <w:p>
+      <w:pPr>
+        <w:jc w:val="both"/>
+        <w:rPr>
+          <w:lang w:bidi="hi-IN"/>
+        </w:rPr>
+      </w:pPr>
+      <w:r>
+        <w:rPr>
+          <w:rFonts w:ascii="Mangal" w:hAnsi="Mangal" w:cs="Mangal"/>
+          <w:b/>
+          <w:bCs/>
+          <w:lang w:bidi="hi-IN"/>
+        </w:rPr>
+        <w:t>home page me "</w:t>
+      </w:r>
+      <w:r>
+        <w:rPr>
+          <w:rFonts w:ascii="Mangal" w:hAnsi="Mangal" w:cs="Mangal"/>
+          <w:b/>
+          <w:bCs/>
+          <w:cs/>
+          <w:lang w:bidi="hi-IN"/>
+        </w:rPr>
+        <w:t>समाचार और कार्यक्रम</w:t>
+      </w:r>
+      <w:r>
+        <w:rPr>
+          <w:rFonts w:ascii="Mangal" w:hAnsi="Mangal" w:cs="Mangal"/>
+          <w:b/>
+          <w:bCs/>
+          <w:lang w:bidi="hi-IN"/>
+        </w:rPr>
+        <w:t xml:space="preserve"> | </w:t>
+      </w:r>
+      <w:r>
+        <w:rPr>
+          <w:rFonts w:ascii="Mangal" w:hAnsi="Mangal" w:cs="Mangal"/>
+          <w:b/>
+          <w:bCs/>
+          <w:cs/>
+          <w:lang w:bidi="hi-IN"/>
+        </w:rPr>
+        <w:t>कॉलेज समाचार</w:t>
+      </w:r>
+      <w:r>
+        <w:rPr>
+          <w:rFonts w:ascii="Mangal" w:hAnsi="Mangal" w:cs="Mangal"/>
+          <w:b/>
+          <w:bCs/>
+          <w:lang w:bidi="hi-IN"/>
+        </w:rPr>
+        <w:t>" me "</w:t>
+      </w:r>
+      <w:r>
+        <w:rPr>
+          <w:rFonts w:ascii="Mangal" w:hAnsi="Mangal" w:cs="Mangal" w:hint="cs"/>
+          <w:b/>
+          <w:bCs/>
+          <w:cs/>
+          <w:lang w:bidi="hi-IN"/>
+        </w:rPr>
+        <w:t>वार्षिक</w:t>
+      </w:r>
+      <w:r>
+        <w:rPr>
+          <w:b/>
+          <w:bCs/>
+          <w:cs/>
+          <w:lang w:bidi="hi-IN"/>
+        </w:rPr>
+        <w:t xml:space="preserve"> </w:t>
+      </w:r>
+      <w:r>
+        <w:rPr>
+          <w:rFonts w:ascii="Mangal" w:hAnsi="Mangal" w:cs="Mangal" w:hint="cs"/>
+          <w:b/>
+          <w:bCs/>
+          <w:cs/>
+          <w:lang w:bidi="hi-IN"/>
+        </w:rPr>
+        <w:t>वृक्षारोपण</w:t>
+      </w:r>
+      <w:r>
+        <w:rPr>
+          <w:b/>
+          <w:bCs/>
+          <w:cs/>
+          <w:lang w:bidi="hi-IN"/>
+        </w:rPr>
+        <w:t xml:space="preserve"> </w:t>
+      </w:r>
+      <w:r>
+        <w:rPr>
+          <w:rFonts w:ascii="Mangal" w:hAnsi="Mangal" w:cs="Mangal" w:hint="cs"/>
+          <w:b/>
+          <w:bCs/>
+          <w:cs/>
+          <w:lang w:bidi="hi-IN"/>
+        </w:rPr>
+        <w:t>अभियान</w:t>
+      </w:r>
+      <w:r>
+        <w:rPr>
+          <w:b/>
+          <w:bCs/>
+          <w:cs/>
+          <w:lang w:bidi="hi-IN"/>
+        </w:rPr>
+        <w:t xml:space="preserve"> </w:t>
+      </w:r>
+      <w:r>
+        <w:rPr>
+          <w:rFonts w:ascii="Mangal" w:hAnsi="Mangal" w:cs="Mangal" w:hint="cs"/>
+          <w:b/>
+          <w:bCs/>
+          <w:cs/>
+          <w:lang w:bidi="hi-IN"/>
+        </w:rPr>
+        <w:t>का</w:t>
+      </w:r>
+      <w:r>
+        <w:rPr>
+          <w:b/>
+          <w:bCs/>
+          <w:cs/>
+          <w:lang w:bidi="hi-IN"/>
+        </w:rPr>
+        <w:t xml:space="preserve"> </w:t>
+      </w:r>
+      <w:r>
+        <w:rPr>
+          <w:rFonts w:ascii="Mangal" w:hAnsi="Mangal" w:cs="Mangal" w:hint="cs"/>
+          <w:b/>
+          <w:bCs/>
+          <w:cs/>
+          <w:lang w:bidi="hi-IN"/>
+        </w:rPr>
+        <w:t>सफल</w:t>
+      </w:r>
+      <w:r>
+        <w:rPr>
+          <w:b/>
+          <w:bCs/>
+          <w:cs/>
+          <w:lang w:bidi="hi-IN"/>
+        </w:rPr>
+        <w:t xml:space="preserve"> </w:t>
+      </w:r>
+      <w:r>
+        <w:rPr>
+          <w:rFonts w:ascii="Mangal" w:hAnsi="Mangal" w:cs="Mangal" w:hint="cs"/>
+          <w:b/>
+          <w:bCs/>
+          <w:cs/>
+          <w:lang w:bidi="hi-IN"/>
+        </w:rPr>
+        <w:t>समापन</w:t>
+      </w:r>
+      <w:r>
+        <w:rPr>
+          <w:rFonts w:ascii="Mangal" w:hAnsi="Mangal" w:cs="Mangal"/>
+          <w:b/>
+          <w:bCs/>
+          <w:lang w:bidi="hi-IN"/>
+        </w:rPr>
+        <w:t xml:space="preserve">" </w:t>
+      </w:r>
+      <w:proofErr w:type="spellStart"/>
+      <w:r>
+        <w:rPr>
+          <w:rFonts w:ascii="Mangal" w:hAnsi="Mangal" w:cs="Mangal"/>
+          <w:b/>
+          <w:bCs/>
+          <w:lang w:bidi="hi-IN"/>
+        </w:rPr>
+        <w:t>evam</w:t>
+      </w:r>
+      <w:proofErr w:type="spellEnd"/>
+      <w:r>
+        <w:rPr>
+          <w:rFonts w:ascii="Mangal" w:hAnsi="Mangal" w:cs="Mangal"/>
+          <w:b/>
+          <w:bCs/>
+          <w:lang w:bidi="hi-IN"/>
+        </w:rPr>
+        <w:t xml:space="preserve"> "</w:t>
+      </w:r>
+      <w:r>
+        <w:rPr>
+          <w:rFonts w:ascii="Mangal" w:hAnsi="Mangal" w:cs="Mangal" w:hint="cs"/>
+          <w:b/>
+          <w:bCs/>
+          <w:cs/>
+          <w:lang w:bidi="hi-IN"/>
+        </w:rPr>
+        <w:t>राज्य</w:t>
+      </w:r>
+      <w:r>
+        <w:rPr>
+          <w:b/>
+          <w:bCs/>
+          <w:cs/>
+          <w:lang w:bidi="hi-IN"/>
+        </w:rPr>
+        <w:t xml:space="preserve"> </w:t>
+      </w:r>
+      <w:r>
+        <w:rPr>
+          <w:rFonts w:ascii="Mangal" w:hAnsi="Mangal" w:cs="Mangal" w:hint="cs"/>
+          <w:b/>
+          <w:bCs/>
+          <w:cs/>
+          <w:lang w:bidi="hi-IN"/>
+        </w:rPr>
+        <w:t>रूसा</w:t>
+      </w:r>
+      <w:r>
+        <w:rPr>
+          <w:b/>
+          <w:bCs/>
+          <w:cs/>
+          <w:lang w:bidi="hi-IN"/>
+        </w:rPr>
+        <w:t xml:space="preserve"> (</w:t>
+      </w:r>
+      <w:r>
+        <w:rPr>
+          <w:b/>
+          <w:bCs/>
+        </w:rPr>
+        <w:t xml:space="preserve">RUSA) </w:t>
+      </w:r>
+      <w:r>
+        <w:rPr>
+          <w:rFonts w:ascii="Mangal" w:hAnsi="Mangal" w:cs="Mangal" w:hint="cs"/>
+          <w:b/>
+          <w:bCs/>
+          <w:cs/>
+          <w:lang w:bidi="hi-IN"/>
+        </w:rPr>
+        <w:t>अनुदान</w:t>
+      </w:r>
+      <w:r>
+        <w:rPr>
+          <w:b/>
+          <w:bCs/>
+          <w:cs/>
+          <w:lang w:bidi="hi-IN"/>
+        </w:rPr>
+        <w:t xml:space="preserve"> </w:t>
+      </w:r>
+      <w:r>
+        <w:rPr>
+          <w:rFonts w:ascii="Mangal" w:hAnsi="Mangal" w:cs="Mangal" w:hint="cs"/>
+          <w:b/>
+          <w:bCs/>
+          <w:cs/>
+          <w:lang w:bidi="hi-IN"/>
+        </w:rPr>
+        <w:t>के</w:t>
+      </w:r>
+      <w:r>
+        <w:rPr>
+          <w:b/>
+          <w:bCs/>
+          <w:cs/>
+          <w:lang w:bidi="hi-IN"/>
+        </w:rPr>
+        <w:t xml:space="preserve"> </w:t>
+      </w:r>
+      <w:r>
+        <w:rPr>
+          <w:rFonts w:ascii="Mangal" w:hAnsi="Mangal" w:cs="Mangal" w:hint="cs"/>
+          <w:b/>
+          <w:bCs/>
+          <w:cs/>
+          <w:lang w:bidi="hi-IN"/>
+        </w:rPr>
+        <w:t>तहत</w:t>
+      </w:r>
+      <w:r>
+        <w:rPr>
+          <w:b/>
+          <w:bCs/>
+          <w:cs/>
+          <w:lang w:bidi="hi-IN"/>
+        </w:rPr>
+        <w:t xml:space="preserve"> </w:t>
+      </w:r>
+      <w:r>
+        <w:rPr>
+          <w:rFonts w:ascii="Mangal" w:hAnsi="Mangal" w:cs="Mangal" w:hint="cs"/>
+          <w:b/>
+          <w:bCs/>
+          <w:cs/>
+          <w:lang w:bidi="hi-IN"/>
+        </w:rPr>
+        <w:t>नई</w:t>
+      </w:r>
+      <w:r>
+        <w:rPr>
+          <w:b/>
+          <w:bCs/>
+          <w:cs/>
+          <w:lang w:bidi="hi-IN"/>
+        </w:rPr>
+        <w:t xml:space="preserve"> </w:t>
+      </w:r>
+      <w:r>
+        <w:rPr>
+          <w:rFonts w:ascii="Mangal" w:hAnsi="Mangal" w:cs="Mangal" w:hint="cs"/>
+          <w:b/>
+          <w:bCs/>
+          <w:cs/>
+          <w:lang w:bidi="hi-IN"/>
+        </w:rPr>
+        <w:t>भौतिकी</w:t>
+      </w:r>
+      <w:r>
+        <w:rPr>
+          <w:b/>
+          <w:bCs/>
+          <w:cs/>
+          <w:lang w:bidi="hi-IN"/>
+        </w:rPr>
+        <w:t xml:space="preserve"> </w:t>
+      </w:r>
+      <w:r>
+        <w:rPr>
+          <w:rFonts w:ascii="Mangal" w:hAnsi="Mangal" w:cs="Mangal" w:hint="cs"/>
+          <w:b/>
+          <w:bCs/>
+          <w:cs/>
+          <w:lang w:bidi="hi-IN"/>
+        </w:rPr>
+        <w:t>प्रयोगशाला</w:t>
+      </w:r>
+      <w:r>
+        <w:rPr>
+          <w:b/>
+          <w:bCs/>
+          <w:cs/>
+          <w:lang w:bidi="hi-IN"/>
+        </w:rPr>
+        <w:t xml:space="preserve"> </w:t>
+      </w:r>
+      <w:r>
+        <w:rPr>
+          <w:rFonts w:ascii="Mangal" w:hAnsi="Mangal" w:cs="Mangal" w:hint="cs"/>
+          <w:b/>
+          <w:bCs/>
+          <w:cs/>
+          <w:lang w:bidi="hi-IN"/>
+        </w:rPr>
+        <w:t>का</w:t>
+      </w:r>
+      <w:r>
+        <w:rPr>
+          <w:b/>
+          <w:bCs/>
+          <w:cs/>
+          <w:lang w:bidi="hi-IN"/>
+        </w:rPr>
+        <w:t xml:space="preserve"> </w:t>
+      </w:r>
+      <w:r>
+        <w:rPr>
+          <w:rFonts w:ascii="Mangal" w:hAnsi="Mangal" w:cs="Mangal" w:hint="cs"/>
+          <w:b/>
+          <w:bCs/>
+          <w:cs/>
+          <w:lang w:bidi="hi-IN"/>
+        </w:rPr>
+        <w:t>उद्घाटन</w:t>
+      </w:r>
+      <w:r>
+        <w:rPr>
+          <w:rFonts w:ascii="Mangal" w:hAnsi="Mangal" w:cs="Mangal"/>
+          <w:b/>
+          <w:bCs/>
+          <w:lang w:bidi="hi-IN"/>
+        </w:rPr>
+        <w:t xml:space="preserve">" ka photograph ko </w:t>
+      </w:r>
+      <w:proofErr w:type="spellStart"/>
+      <w:r>
+        <w:rPr>
+          <w:rFonts w:ascii="Mangal" w:hAnsi="Mangal" w:cs="Mangal"/>
+          <w:b/>
+          <w:bCs/>
+          <w:lang w:bidi="hi-IN"/>
+        </w:rPr>
+        <w:t>badalne</w:t>
+      </w:r>
+      <w:proofErr w:type="spellEnd"/>
+      <w:r>
+        <w:rPr>
+          <w:rFonts w:ascii="Mangal" w:hAnsi="Mangal" w:cs="Mangal"/>
+          <w:b/>
+          <w:bCs/>
+          <w:lang w:bidi="hi-IN"/>
+        </w:rPr>
+        <w:t xml:space="preserve"> par </w:t>
+      </w:r>
+      <w:proofErr w:type="spellStart"/>
+      <w:r>
+        <w:rPr>
+          <w:rFonts w:ascii="Mangal" w:hAnsi="Mangal" w:cs="Mangal"/>
+          <w:b/>
+          <w:bCs/>
+          <w:lang w:bidi="hi-IN"/>
+        </w:rPr>
+        <w:t>wapis</w:t>
+      </w:r>
+      <w:proofErr w:type="spellEnd"/>
+      <w:r>
+        <w:rPr>
+          <w:rFonts w:ascii="Mangal" w:hAnsi="Mangal" w:cs="Mangal"/>
+          <w:b/>
+          <w:bCs/>
+          <w:lang w:bidi="hi-IN"/>
+        </w:rPr>
+        <w:t xml:space="preserve"> se </w:t>
+      </w:r>
+      <w:proofErr w:type="spellStart"/>
+      <w:r>
+        <w:rPr>
+          <w:rFonts w:ascii="Mangal" w:hAnsi="Mangal" w:cs="Mangal"/>
+          <w:b/>
+          <w:bCs/>
+          <w:lang w:bidi="hi-IN"/>
+        </w:rPr>
+        <w:t>wahi</w:t>
+      </w:r>
+      <w:proofErr w:type="spellEnd"/>
+      <w:r>
+        <w:rPr>
+          <w:rFonts w:ascii="Mangal" w:hAnsi="Mangal" w:cs="Mangal"/>
+          <w:b/>
+          <w:bCs/>
+          <w:lang w:bidi="hi-IN"/>
+        </w:rPr>
+        <w:t xml:space="preserve"> picture aa </w:t>
+      </w:r>
+      <w:proofErr w:type="spellStart"/>
+      <w:r>
+        <w:rPr>
+          <w:rFonts w:ascii="Mangal" w:hAnsi="Mangal" w:cs="Mangal"/>
+          <w:b/>
+          <w:bCs/>
+          <w:lang w:bidi="hi-IN"/>
+        </w:rPr>
+        <w:t>jata</w:t>
+      </w:r>
+      <w:proofErr w:type="spellEnd"/>
+      <w:r>
+        <w:rPr>
+          <w:rFonts w:ascii="Mangal" w:hAnsi="Mangal" w:cs="Mangal"/>
+          <w:b/>
+          <w:bCs/>
+          <w:lang w:bidi="hi-IN"/>
+        </w:rPr>
+        <w:t xml:space="preserve"> </w:t>
+      </w:r>
+      <w:proofErr w:type="spellStart"/>
+      <w:r>
+        <w:rPr>
+          <w:rFonts w:ascii="Mangal" w:hAnsi="Mangal" w:cs="Mangal"/>
+          <w:b/>
+          <w:bCs/>
+          <w:lang w:bidi="hi-IN"/>
+        </w:rPr>
+        <w:t>hai</w:t>
+      </w:r>
+      <w:proofErr w:type="spellEnd"/>
+      <w:r>
+        <w:rPr>
+          <w:rFonts w:ascii="Mangal" w:hAnsi="Mangal" w:cs="Mangal"/>
+          <w:b/>
+          <w:bCs/>
+          <w:lang w:bidi="hi-IN"/>
+        </w:rPr>
+        <w:t xml:space="preserve">. </w:t>
+      </w:r>
+      <w:proofErr w:type="spellStart"/>
+      <w:r>
+        <w:rPr>
+          <w:rFonts w:ascii="Mangal" w:hAnsi="Mangal" w:cs="Mangal"/>
+          <w:b/>
+          <w:bCs/>
+          <w:lang w:bidi="hi-IN"/>
+        </w:rPr>
+        <w:t>aisa</w:t>
+      </w:r>
+      <w:proofErr w:type="spellEnd"/>
+      <w:r>
+        <w:rPr>
+          <w:rFonts w:ascii="Mangal" w:hAnsi="Mangal" w:cs="Mangal"/>
+          <w:b/>
+          <w:bCs/>
+          <w:lang w:bidi="hi-IN"/>
+        </w:rPr>
+        <w:t xml:space="preserve"> kyu </w:t>
+      </w:r>
+      <w:proofErr w:type="spellStart"/>
+      <w:r>
+        <w:rPr>
+          <w:rFonts w:ascii="Mangal" w:hAnsi="Mangal" w:cs="Mangal"/>
+          <w:b/>
+          <w:bCs/>
+          <w:lang w:bidi="hi-IN"/>
+        </w:rPr>
+        <w:t>ho</w:t>
+      </w:r>
+      <w:proofErr w:type="spellEnd"/>
+      <w:r>
+        <w:rPr>
+          <w:rFonts w:ascii="Mangal" w:hAnsi="Mangal" w:cs="Mangal"/>
+          <w:b/>
+          <w:bCs/>
+          <w:lang w:bidi="hi-IN"/>
+        </w:rPr>
+        <w:t xml:space="preserve"> </w:t>
+      </w:r>
+      <w:proofErr w:type="spellStart"/>
+      <w:r>
+        <w:rPr>
+          <w:rFonts w:ascii="Mangal" w:hAnsi="Mangal" w:cs="Mangal"/>
+          <w:b/>
+          <w:bCs/>
+          <w:lang w:bidi="hi-IN"/>
+        </w:rPr>
+        <w:t>raha</w:t>
+      </w:r>
+      <w:proofErr w:type="spellEnd"/>
+      <w:r>
+        <w:rPr>
+          <w:rFonts w:ascii="Mangal" w:hAnsi="Mangal" w:cs="Mangal"/>
+          <w:b/>
+          <w:bCs/>
+          <w:lang w:bidi="hi-IN"/>
+        </w:rPr>
+        <w:t xml:space="preserve"> </w:t>
+      </w:r>
+      <w:proofErr w:type="spellStart"/>
+      <w:r>
+        <w:rPr>
+          <w:rFonts w:ascii="Mangal" w:hAnsi="Mangal" w:cs="Mangal"/>
+          <w:b/>
+          <w:bCs/>
+          <w:lang w:bidi="hi-IN"/>
+        </w:rPr>
+        <w:t>hai</w:t>
+      </w:r>
+      <w:proofErr w:type="spellEnd"/>
+      <w:r>
+        <w:rPr>
+          <w:rFonts w:ascii="Mangal" w:hAnsi="Mangal" w:cs="Mangal"/>
+          <w:b/>
+          <w:bCs/>
+          <w:lang w:bidi="hi-IN"/>
+        </w:rPr>
+        <w:t>?</w:t>
       </w:r>
     </w:p>
     <w:sectPr>
       <w:pgSz w:w="11906" w:h="16838"/>
-      <w:pgMar w:top="1440" w:right="1440" w:bottom="1440" w:left="1440" w:header="708" w:footer="708" w:gutter="0"/>
+      <w:pgMar w:top="1440" w:right="1133" w:bottom="1440" w:left="1440" w:header="708" w:footer="708" w:gutter="0"/>
       <w:cols w:space="708"/>
       <w:docGrid w:linePitch="360"/>
     </w:sectPr>
@@ -1397,7 +2099,6 @@
     <w:next w:val="Normal"/>
     <w:link w:val="Heading3Char"/>
     <w:uiPriority w:val="9"/>
-    <w:semiHidden/>
     <w:unhideWhenUsed/>
     <w:qFormat/>
     <w:rsid w:val="00A94FEB"/>
@@ -1420,7 +2121,6 @@
     <w:next w:val="Normal"/>
     <w:link w:val="Heading4Char"/>
     <w:uiPriority w:val="9"/>
-    <w:semiHidden/>
     <w:unhideWhenUsed/>
     <w:qFormat/>
     <w:rsid w:val="00A94FEB"/>
@@ -1549,7 +2249,6 @@
   <w:style w:type="character" w:default="1" w:styleId="DefaultParagraphFont">
     <w:name w:val="Default Paragraph Font"/>
     <w:uiPriority w:val="1"/>
-    <w:semiHidden/>
     <w:unhideWhenUsed/>
   </w:style>
   <w:style w:type="table" w:default="1" w:styleId="TableNormal">
@@ -1605,7 +2304,6 @@
     <w:basedOn w:val="DefaultParagraphFont"/>
     <w:link w:val="Heading3"/>
     <w:uiPriority w:val="9"/>
-    <w:semiHidden/>
     <w:rsid w:val="00A94FEB"/>
     <w:rPr>
       <w:rFonts w:eastAsiaTheme="majorEastAsia" w:cstheme="majorBidi"/>
@@ -1619,7 +2317,6 @@
     <w:basedOn w:val="DefaultParagraphFont"/>
     <w:link w:val="Heading4"/>
     <w:uiPriority w:val="9"/>
-    <w:semiHidden/>
     <w:rsid w:val="00A94FEB"/>
     <w:rPr>
       <w:rFonts w:eastAsiaTheme="majorEastAsia" w:cstheme="majorBidi"/>

</xml_diff>